<commit_message>
fix: prescription details pdf
</commit_message>
<xml_diff>
--- a/src/templates/prescription_template.docx
+++ b/src/templates/prescription_template.docx
@@ -202,6 +202,7 @@
         </w:rPr>
         <w:t>: {{</w:t>
       </w:r>
+      <w:proofErr w:type="spellStart"/>
       <w:r>
         <w:rPr>
           <w:rFonts w:ascii="Times New Roman" w:eastAsia="MS Mincho" w:hAnsi="Times New Roman" w:cs="Times New Roman"/>
@@ -209,6 +210,7 @@
         </w:rPr>
         <w:t>prescriptionCode</w:t>
       </w:r>
+      <w:proofErr w:type="spellEnd"/>
       <w:r>
         <w:rPr>
           <w:rFonts w:ascii="Times New Roman" w:eastAsia="Times New Roman" w:hAnsi="Times New Roman" w:cs="Times New Roman"/>
@@ -724,9 +726,10 @@
         <w:ind w:left="-425" w:right="6"/>
         <w:jc w:val="right"/>
         <w:rPr>
-          <w:rFonts w:ascii="Times New Roman" w:eastAsia="Times New Roman" w:hAnsi="Times New Roman" w:cs="Times New Roman"/>
+          <w:rFonts w:ascii="Times New Roman" w:eastAsiaTheme="minorEastAsia" w:hAnsi="Times New Roman" w:cs="Times New Roman"/>
           <w:i/>
           <w:iCs/>
+          <w:lang w:eastAsia="ja-JP"/>
         </w:rPr>
       </w:pPr>
       <w:r>
@@ -745,6 +748,25 @@
         </w:rPr>
         <w:tab/>
         <w:t>{{usage}}</w:t>
+      </w:r>
+    </w:p>
+    <w:p>
+      <w:pPr>
+        <w:keepLines/>
+        <w:spacing w:after="120" w:line="240" w:lineRule="auto"/>
+        <w:ind w:left="-425" w:right="6"/>
+        <w:jc w:val="right"/>
+        <w:rPr>
+          <w:rFonts w:ascii="Times New Roman" w:eastAsiaTheme="minorEastAsia" w:hAnsi="Times New Roman" w:cs="Times New Roman"/>
+          <w:lang w:val="vi-VN" w:eastAsia="ja-JP"/>
+        </w:rPr>
+      </w:pPr>
+      <w:r>
+        <w:rPr>
+          <w:rFonts w:ascii="Times New Roman" w:eastAsiaTheme="minorEastAsia" w:hAnsi="Times New Roman" w:cs="Times New Roman"/>
+          <w:lang w:val="vi-VN" w:eastAsia="ja-JP"/>
+        </w:rPr>
+        <w:t>{{prepNote}}</w:t>
       </w:r>
     </w:p>
     <w:p>
@@ -861,7 +883,6 @@
           <w:rFonts w:ascii="Times New Roman" w:eastAsia="Times New Roman" w:hAnsi="Times New Roman" w:cs="Times New Roman"/>
           <w:color w:val="081B3A"/>
           <w:highlight w:val="white"/>
-          <w:lang w:val="en-US"/>
         </w:rPr>
       </w:pPr>
       <w:r>
@@ -926,7 +947,6 @@
           <w:rFonts w:ascii="Times New Roman" w:eastAsia="Times New Roman" w:hAnsi="Times New Roman" w:cs="Times New Roman"/>
           <w:color w:val="081B3A"/>
           <w:highlight w:val="white"/>
-          <w:lang w:val="en-US"/>
         </w:rPr>
         <w:tab/>
       </w:r>

</xml_diff>

<commit_message>
fix: printcount in pdf
</commit_message>
<xml_diff>
--- a/src/templates/prescription_template.docx
+++ b/src/templates/prescription_template.docx
@@ -180,7 +180,10 @@
         <w:ind w:left="-425" w:right="-436"/>
         <w:jc w:val="center"/>
         <w:rPr>
-          <w:rFonts w:ascii="Times New Roman" w:eastAsia="Times New Roman" w:hAnsi="Times New Roman" w:cs="Times New Roman"/>
+          <w:rFonts w:ascii="Calibri" w:eastAsiaTheme="minorEastAsia" w:hAnsi="Calibri" w:cs="Calibri" w:hint="eastAsia"/>
+          <w:b/>
+          <w:bCs/>
+          <w:lang w:val="vi-VN" w:eastAsia="ja-JP"/>
         </w:rPr>
       </w:pPr>
       <w:r>
@@ -205,7 +208,7 @@
       <w:r>
         <w:rPr>
           <w:rFonts w:ascii="Times New Roman" w:eastAsia="MS Mincho" w:hAnsi="Times New Roman" w:cs="Times New Roman"/>
-          <w:lang w:val="en-US" w:eastAsia="ja-JP"/>
+          <w:lang w:eastAsia="ja-JP"/>
         </w:rPr>
         <w:t>prescriptionCode</w:t>
       </w:r>
@@ -214,6 +217,24 @@
           <w:rFonts w:ascii="Times New Roman" w:eastAsia="Times New Roman" w:hAnsi="Times New Roman" w:cs="Times New Roman"/>
         </w:rPr>
         <w:t>}}</w:t>
+      </w:r>
+      <w:r>
+        <w:rPr>
+          <w:rFonts w:ascii="Times New Roman" w:eastAsiaTheme="minorEastAsia" w:hAnsi="Times New Roman" w:cs="Times New Roman"/>
+          <w:b/>
+          <w:bCs/>
+          <w:lang w:eastAsia="ja-JP"/>
+        </w:rPr>
+        <w:t>{</w:t>
+      </w:r>
+      <w:r>
+        <w:rPr>
+          <w:rFonts w:ascii="Times New Roman" w:eastAsiaTheme="minorEastAsia" w:hAnsi="Times New Roman" w:cs="Times New Roman"/>
+          <w:b/>
+          <w:bCs/>
+          <w:lang w:val="vi-VN" w:eastAsia="ja-JP"/>
+        </w:rPr>
+        <w:t>{printCount}}</w:t>
       </w:r>
     </w:p>
     <w:p>

</xml_diff>

<commit_message>
fix: data display for prescription
</commit_message>
<xml_diff>
--- a/src/templates/prescription_template.docx
+++ b/src/templates/prescription_template.docx
@@ -180,7 +180,7 @@
         <w:ind w:left="-425" w:right="-436"/>
         <w:jc w:val="center"/>
         <w:rPr>
-          <w:rFonts w:ascii="Calibri" w:eastAsiaTheme="minorEastAsia" w:hAnsi="Calibri" w:cs="Calibri" w:hint="eastAsia"/>
+          <w:rFonts w:ascii="Calibri" w:eastAsiaTheme="minorEastAsia" w:hAnsi="Calibri" w:cs="Calibri"/>
           <w:b/>
           <w:bCs/>
           <w:lang w:val="vi-VN" w:eastAsia="ja-JP"/>
@@ -221,8 +221,6 @@
       <w:r>
         <w:rPr>
           <w:rFonts w:ascii="Times New Roman" w:eastAsiaTheme="minorEastAsia" w:hAnsi="Times New Roman" w:cs="Times New Roman"/>
-          <w:b/>
-          <w:bCs/>
           <w:lang w:eastAsia="ja-JP"/>
         </w:rPr>
         <w:t>{</w:t>
@@ -230,8 +228,6 @@
       <w:r>
         <w:rPr>
           <w:rFonts w:ascii="Times New Roman" w:eastAsiaTheme="minorEastAsia" w:hAnsi="Times New Roman" w:cs="Times New Roman"/>
-          <w:b/>
-          <w:bCs/>
           <w:lang w:val="vi-VN" w:eastAsia="ja-JP"/>
         </w:rPr>
         <w:t>{printCount}}</w:t>
@@ -780,15 +776,6 @@
           <w:iCs/>
         </w:rPr>
         <w:t>}}</w:t>
-      </w:r>
-      <w:r>
-        <w:rPr>
-          <w:rFonts w:ascii="Times New Roman" w:eastAsiaTheme="minorEastAsia" w:hAnsi="Times New Roman" w:cs="Times New Roman" w:hint="eastAsia"/>
-          <w:i/>
-          <w:iCs/>
-          <w:lang w:eastAsia="ja-JP"/>
-        </w:rPr>
-        <w:t xml:space="preserve"> </w:t>
       </w:r>
       <w:r>
         <w:rPr>

</xml_diff>

<commit_message>
fix: file template structure to print
</commit_message>
<xml_diff>
--- a/src/templates/prescription_template.docx
+++ b/src/templates/prescription_template.docx
@@ -208,6 +208,15 @@
           <w:lang w:val="en-US"/>
         </w:rPr>
         <w:t>clinicPhones</w:t>
+      </w:r>
+      <w:r>
+        <w:rPr>
+          <w:rFonts w:ascii="Times New Roman" w:eastAsiaTheme="minorEastAsia" w:hAnsi="Times New Roman" w:cs="Times New Roman" w:hint="eastAsia"/>
+          <w:sz w:val="20"/>
+          <w:szCs w:val="20"/>
+          <w:lang w:val="en-US" w:eastAsia="ja-JP"/>
+        </w:rPr>
+        <w:t>Text</w:t>
       </w:r>
       <w:proofErr w:type="spellEnd"/>
       <w:r>
@@ -910,7 +919,7 @@
           <w:iCs/>
           <w:color w:val="081B3A"/>
           <w:highlight w:val="white"/>
-          <w:lang w:val="en-US" w:eastAsia="ja-JP"/>
+          <w:lang w:eastAsia="ja-JP"/>
         </w:rPr>
       </w:pPr>
       <w:r>
@@ -944,7 +953,7 @@
           <w:iCs/>
           <w:color w:val="081B3A"/>
           <w:highlight w:val="white"/>
-          <w:lang w:val="en-US" w:eastAsia="ja-JP"/>
+          <w:lang w:eastAsia="ja-JP"/>
         </w:rPr>
         <w:t xml:space="preserve">. </w:t>
       </w:r>
@@ -958,7 +967,7 @@
           <w:iCs/>
           <w:color w:val="081B3A"/>
           <w:highlight w:val="white"/>
-          <w:lang w:val="en-US" w:eastAsia="ja-JP"/>
+          <w:lang w:eastAsia="ja-JP"/>
         </w:rPr>
       </w:pPr>
       <w:r>
@@ -968,7 +977,7 @@
           <w:iCs/>
           <w:color w:val="081B3A"/>
           <w:highlight w:val="white"/>
-          <w:lang w:val="en-US" w:eastAsia="ja-JP"/>
+          <w:lang w:eastAsia="ja-JP"/>
         </w:rPr>
         <w:t>{{reason}}</w:t>
       </w:r>
@@ -982,7 +991,7 @@
           <w:iCs/>
           <w:color w:val="081B3A"/>
           <w:highlight w:val="white"/>
-          <w:lang w:val="en-US" w:eastAsia="ja-JP"/>
+          <w:lang w:eastAsia="ja-JP"/>
         </w:rPr>
       </w:pPr>
       <w:r>
@@ -1016,7 +1025,7 @@
           <w:iCs/>
           <w:color w:val="081B3A"/>
           <w:highlight w:val="white"/>
-          <w:lang w:val="en-US" w:eastAsia="ja-JP"/>
+          <w:lang w:eastAsia="ja-JP"/>
         </w:rPr>
       </w:pPr>
     </w:p>

</xml_diff>

<commit_message>
fix: file print pre-check
</commit_message>
<xml_diff>
--- a/src/templates/prescription_template.docx
+++ b/src/templates/prescription_template.docx
@@ -23,111 +23,108 @@
           <w:szCs w:val="20"/>
           <w:lang w:val="en-US"/>
         </w:rPr>
-        <w:t>{{</w:t>
-      </w:r>
-      <w:proofErr w:type="spellStart"/>
-      <w:r>
-        <w:rPr>
-          <w:rFonts w:ascii="Times New Roman" w:eastAsia="Times New Roman" w:hAnsi="Times New Roman" w:cs="Times New Roman"/>
-          <w:b/>
-          <w:bCs/>
+        <w:t>{{clinicName}}</w:t>
+      </w:r>
+      <w:r>
+        <w:rPr>
+          <w:rFonts w:ascii="Times New Roman" w:eastAsia="Times New Roman" w:hAnsi="Times New Roman" w:cs="Times New Roman"/>
+          <w:b/>
+          <w:bCs/>
+          <w:sz w:val="20"/>
+          <w:szCs w:val="20"/>
+        </w:rPr>
+        <w:tab/>
+      </w:r>
+      <w:r>
+        <w:rPr>
+          <w:rFonts w:ascii="Times New Roman" w:eastAsia="Times New Roman" w:hAnsi="Times New Roman" w:cs="Times New Roman"/>
+          <w:b/>
+          <w:bCs/>
+          <w:sz w:val="20"/>
+          <w:szCs w:val="20"/>
+        </w:rPr>
+        <w:tab/>
+      </w:r>
+      <w:r>
+        <w:rPr>
+          <w:rFonts w:ascii="Times New Roman" w:eastAsia="Times New Roman" w:hAnsi="Times New Roman" w:cs="Times New Roman"/>
+          <w:b/>
+          <w:bCs/>
+          <w:sz w:val="20"/>
+          <w:szCs w:val="20"/>
+        </w:rPr>
+        <w:tab/>
+      </w:r>
+      <w:r>
+        <w:rPr>
+          <w:rFonts w:ascii="Times New Roman" w:eastAsia="Times New Roman" w:hAnsi="Times New Roman" w:cs="Times New Roman"/>
+          <w:b/>
+          <w:bCs/>
+          <w:sz w:val="20"/>
+          <w:szCs w:val="20"/>
+        </w:rPr>
+        <w:tab/>
+      </w:r>
+      <w:r>
+        <w:rPr>
+          <w:rFonts w:ascii="Times New Roman" w:eastAsia="Times New Roman" w:hAnsi="Times New Roman" w:cs="Times New Roman"/>
+          <w:b/>
+          <w:bCs/>
+          <w:sz w:val="20"/>
+          <w:szCs w:val="20"/>
+        </w:rPr>
+        <w:tab/>
+      </w:r>
+      <w:r>
+        <w:rPr>
+          <w:rFonts w:ascii="Times New Roman" w:eastAsia="Times New Roman" w:hAnsi="Times New Roman" w:cs="Times New Roman"/>
+          <w:b/>
+          <w:bCs/>
+          <w:sz w:val="20"/>
+          <w:szCs w:val="20"/>
+        </w:rPr>
+        <w:tab/>
+      </w:r>
+      <w:r>
+        <w:rPr>
+          <w:rFonts w:ascii="Times New Roman" w:eastAsia="Times New Roman" w:hAnsi="Times New Roman" w:cs="Times New Roman"/>
+          <w:b/>
+          <w:bCs/>
+          <w:sz w:val="20"/>
+          <w:szCs w:val="20"/>
+        </w:rPr>
+        <w:tab/>
+      </w:r>
+      <w:r>
+        <w:rPr>
+          <w:rFonts w:ascii="Times New Roman" w:eastAsia="Times New Roman" w:hAnsi="Times New Roman" w:cs="Times New Roman"/>
+          <w:b/>
+          <w:bCs/>
+          <w:sz w:val="20"/>
+          <w:szCs w:val="20"/>
+        </w:rPr>
+        <w:tab/>
+      </w:r>
+    </w:p>
+    <w:p>
+      <w:pPr>
+        <w:spacing w:after="120" w:line="240" w:lineRule="auto"/>
+        <w:ind w:left="-425" w:right="-436"/>
+        <w:rPr>
+          <w:rFonts w:ascii="Times New Roman" w:eastAsia="Times New Roman" w:hAnsi="Times New Roman" w:cs="Times New Roman"/>
           <w:sz w:val="20"/>
           <w:szCs w:val="20"/>
           <w:lang w:val="en-US"/>
         </w:rPr>
-        <w:t>clinicName</w:t>
-      </w:r>
-      <w:proofErr w:type="spellEnd"/>
-      <w:r>
-        <w:rPr>
-          <w:rFonts w:ascii="Times New Roman" w:eastAsia="Times New Roman" w:hAnsi="Times New Roman" w:cs="Times New Roman"/>
-          <w:b/>
-          <w:bCs/>
+      </w:pPr>
+      <w:r>
+        <w:rPr>
+          <w:rFonts w:ascii="Times New Roman" w:eastAsia="Times New Roman" w:hAnsi="Times New Roman" w:cs="Times New Roman"/>
           <w:sz w:val="20"/>
           <w:szCs w:val="20"/>
           <w:lang w:val="en-US"/>
         </w:rPr>
-        <w:t>}}</w:t>
-      </w:r>
-      <w:r>
-        <w:rPr>
-          <w:rFonts w:ascii="Times New Roman" w:eastAsia="Times New Roman" w:hAnsi="Times New Roman" w:cs="Times New Roman"/>
-          <w:b/>
-          <w:bCs/>
-          <w:sz w:val="20"/>
-          <w:szCs w:val="20"/>
-        </w:rPr>
-        <w:tab/>
-      </w:r>
-      <w:r>
-        <w:rPr>
-          <w:rFonts w:ascii="Times New Roman" w:eastAsia="Times New Roman" w:hAnsi="Times New Roman" w:cs="Times New Roman"/>
-          <w:b/>
-          <w:bCs/>
-          <w:sz w:val="20"/>
-          <w:szCs w:val="20"/>
-        </w:rPr>
-        <w:tab/>
-      </w:r>
-      <w:r>
-        <w:rPr>
-          <w:rFonts w:ascii="Times New Roman" w:eastAsia="Times New Roman" w:hAnsi="Times New Roman" w:cs="Times New Roman"/>
-          <w:b/>
-          <w:bCs/>
-          <w:sz w:val="20"/>
-          <w:szCs w:val="20"/>
-        </w:rPr>
-        <w:tab/>
-      </w:r>
-      <w:r>
-        <w:rPr>
-          <w:rFonts w:ascii="Times New Roman" w:eastAsia="Times New Roman" w:hAnsi="Times New Roman" w:cs="Times New Roman"/>
-          <w:b/>
-          <w:bCs/>
-          <w:sz w:val="20"/>
-          <w:szCs w:val="20"/>
-        </w:rPr>
-        <w:tab/>
-      </w:r>
-      <w:r>
-        <w:rPr>
-          <w:rFonts w:ascii="Times New Roman" w:eastAsia="Times New Roman" w:hAnsi="Times New Roman" w:cs="Times New Roman"/>
-          <w:b/>
-          <w:bCs/>
-          <w:sz w:val="20"/>
-          <w:szCs w:val="20"/>
-        </w:rPr>
-        <w:tab/>
-      </w:r>
-      <w:r>
-        <w:rPr>
-          <w:rFonts w:ascii="Times New Roman" w:eastAsia="Times New Roman" w:hAnsi="Times New Roman" w:cs="Times New Roman"/>
-          <w:b/>
-          <w:bCs/>
-          <w:sz w:val="20"/>
-          <w:szCs w:val="20"/>
-        </w:rPr>
-        <w:tab/>
-      </w:r>
-      <w:r>
-        <w:rPr>
-          <w:rFonts w:ascii="Times New Roman" w:eastAsia="Times New Roman" w:hAnsi="Times New Roman" w:cs="Times New Roman"/>
-          <w:b/>
-          <w:bCs/>
-          <w:sz w:val="20"/>
-          <w:szCs w:val="20"/>
-        </w:rPr>
-        <w:tab/>
-      </w:r>
-      <w:r>
-        <w:rPr>
-          <w:rFonts w:ascii="Times New Roman" w:eastAsia="Times New Roman" w:hAnsi="Times New Roman" w:cs="Times New Roman"/>
-          <w:b/>
-          <w:bCs/>
-          <w:sz w:val="20"/>
-          <w:szCs w:val="20"/>
-        </w:rPr>
-        <w:tab/>
+        <w:t>{{clinicAddress}}</w:t>
       </w:r>
     </w:p>
     <w:p>
@@ -146,11 +143,9 @@
           <w:rFonts w:ascii="Times New Roman" w:eastAsia="Times New Roman" w:hAnsi="Times New Roman" w:cs="Times New Roman"/>
           <w:sz w:val="20"/>
           <w:szCs w:val="20"/>
-          <w:lang w:val="en-US"/>
-        </w:rPr>
-        <w:t>{{</w:t>
-      </w:r>
-      <w:proofErr w:type="spellStart"/>
+        </w:rPr>
+        <w:t xml:space="preserve">SĐT: </w:t>
+      </w:r>
       <w:r>
         <w:rPr>
           <w:rFonts w:ascii="Times New Roman" w:eastAsia="Times New Roman" w:hAnsi="Times New Roman" w:cs="Times New Roman"/>
@@ -158,56 +153,7 @@
           <w:szCs w:val="20"/>
           <w:lang w:val="en-US"/>
         </w:rPr>
-        <w:t>clinicAddress</w:t>
-      </w:r>
-      <w:proofErr w:type="spellEnd"/>
-      <w:r>
-        <w:rPr>
-          <w:rFonts w:ascii="Times New Roman" w:eastAsia="Times New Roman" w:hAnsi="Times New Roman" w:cs="Times New Roman"/>
-          <w:sz w:val="20"/>
-          <w:szCs w:val="20"/>
-          <w:lang w:val="en-US"/>
-        </w:rPr>
-        <w:t>}}</w:t>
-      </w:r>
-    </w:p>
-    <w:p>
-      <w:pPr>
-        <w:spacing w:after="120" w:line="240" w:lineRule="auto"/>
-        <w:ind w:left="-425" w:right="-436"/>
-        <w:rPr>
-          <w:rFonts w:ascii="Times New Roman" w:eastAsia="Times New Roman" w:hAnsi="Times New Roman" w:cs="Times New Roman"/>
-          <w:sz w:val="20"/>
-          <w:szCs w:val="20"/>
-          <w:lang w:val="en-US"/>
-        </w:rPr>
-      </w:pPr>
-      <w:r>
-        <w:rPr>
-          <w:rFonts w:ascii="Times New Roman" w:eastAsia="Times New Roman" w:hAnsi="Times New Roman" w:cs="Times New Roman"/>
-          <w:sz w:val="20"/>
-          <w:szCs w:val="20"/>
-        </w:rPr>
-        <w:t xml:space="preserve">SĐT: </w:t>
-      </w:r>
-      <w:r>
-        <w:rPr>
-          <w:rFonts w:ascii="Times New Roman" w:eastAsia="Times New Roman" w:hAnsi="Times New Roman" w:cs="Times New Roman"/>
-          <w:sz w:val="20"/>
-          <w:szCs w:val="20"/>
-          <w:lang w:val="en-US"/>
-        </w:rPr>
-        <w:t>{{</w:t>
-      </w:r>
-      <w:proofErr w:type="spellStart"/>
-      <w:r>
-        <w:rPr>
-          <w:rFonts w:ascii="Times New Roman" w:eastAsia="Times New Roman" w:hAnsi="Times New Roman" w:cs="Times New Roman"/>
-          <w:sz w:val="20"/>
-          <w:szCs w:val="20"/>
-          <w:lang w:val="en-US"/>
-        </w:rPr>
-        <w:t>clinicPhones</w:t>
+        <w:t>{{clinicPhones</w:t>
       </w:r>
       <w:r>
         <w:rPr>
@@ -218,7 +164,6 @@
         </w:rPr>
         <w:t>Text</w:t>
       </w:r>
-      <w:proofErr w:type="spellEnd"/>
       <w:r>
         <w:rPr>
           <w:rFonts w:ascii="Times New Roman" w:eastAsia="Times New Roman" w:hAnsi="Times New Roman" w:cs="Times New Roman"/>
@@ -876,22 +821,6 @@
         </w:rPr>
         <w:t>{{prepNote}}</w:t>
       </w:r>
-    </w:p>
-    <w:p>
-      <w:pPr>
-        <w:tabs>
-          <w:tab w:val="left" w:pos="127"/>
-          <w:tab w:val="left" w:pos="7371"/>
-          <w:tab w:val="right" w:pos="9000"/>
-          <w:tab w:val="right" w:leader="dot" w:pos="9072"/>
-        </w:tabs>
-        <w:spacing w:after="120" w:line="240" w:lineRule="auto"/>
-        <w:ind w:left="-425" w:right="-436"/>
-        <w:rPr>
-          <w:rFonts w:ascii="Times New Roman" w:eastAsiaTheme="minorEastAsia" w:hAnsi="Times New Roman" w:cs="Times New Roman"/>
-          <w:lang w:val="vi-VN" w:eastAsia="ja-JP"/>
-        </w:rPr>
-      </w:pPr>
       <w:r>
         <w:rPr>
           <w:rFonts w:ascii="Times New Roman" w:eastAsia="Times New Roman" w:hAnsi="Times New Roman" w:cs="Times New Roman"/>
@@ -1290,27 +1219,7 @@
           <w:bCs/>
           <w:lang w:val="en-US"/>
         </w:rPr>
-        <w:t>{{</w:t>
-      </w:r>
-      <w:proofErr w:type="spellStart"/>
-      <w:r>
-        <w:rPr>
-          <w:rFonts w:ascii="Times New Roman" w:eastAsia="Times New Roman" w:hAnsi="Times New Roman" w:cs="Times New Roman"/>
-          <w:b/>
-          <w:bCs/>
-          <w:lang w:val="en-US"/>
-        </w:rPr>
-        <w:t>doctorName</w:t>
-      </w:r>
-      <w:proofErr w:type="spellEnd"/>
-      <w:r>
-        <w:rPr>
-          <w:rFonts w:ascii="Times New Roman" w:eastAsia="Times New Roman" w:hAnsi="Times New Roman" w:cs="Times New Roman"/>
-          <w:b/>
-          <w:bCs/>
-          <w:lang w:val="en-US"/>
-        </w:rPr>
-        <w:t>}}</w:t>
+        <w:t>{{doctorName}}</w:t>
       </w:r>
     </w:p>
     <w:sectPr>

</xml_diff>